<commit_message>
Wire cremation category, payment method and death-time fields into the docx templates
Interview flow, extraction, validation and the manual form already
collected cremation_support_category, payment_method, request_content and
the deceased's death hour/minute for the hỏa táng and mai táng benefit
forms, but ho_tro_hoa_tang.docx and ho_tro_mai_tang.docx never had the
matching {{...}} placeholders: the computed checkbox/value fields had
nowhere to land, so none of this new information reached the generated
Word document. Replace the 19 static "☐" cremation-category lines and the
two payment-method lines with the matching check tokens, split the
poor/near-poor "mã số" blank into its own field per category (mirroring
the existing NQ32/40 support-category pattern), merge death hour/minute
into the existing death-date line, and add the missing "Nội dung đề nghị"
line to the mai táng template. Also fixes the interview tests, which
predated these newly-required fields and tried to skip them.
</commit_message>
<xml_diff>
--- a/templates_word/ho_tro_hoa_tang.docx
+++ b/templates_word/ho_tro_hoa_tang.docx
@@ -183,7 +183,7 @@
           <w:i w:val="0"/>
           <w:sz w:val="26"/>
         </w:rPr>
-        <w:t>☐ Bà mẹ Việt Nam anh hùng</w:t>
+        <w:t>{{cremation_category_1_check}} Bà mẹ Việt Nam anh hùng</w:t>
       </w:r>
     </w:p>
     <w:p>
@@ -193,7 +193,7 @@
           <w:i w:val="0"/>
           <w:sz w:val="26"/>
         </w:rPr>
-        <w:t>☐ Anh hùng lực lượng vũ trang nhân dân, anh hùng lao động</w:t>
+        <w:t>{{cremation_category_2_check}} Anh hùng lực lượng vũ trang nhân dân, anh hùng lao động</w:t>
       </w:r>
     </w:p>
     <w:p>
@@ -203,7 +203,7 @@
           <w:i w:val="0"/>
           <w:sz w:val="26"/>
         </w:rPr>
-        <w:t>☐ Đảng viên có Huy hiệu 40 tuổi Đảng trở lên</w:t>
+        <w:t>{{cremation_category_3_check}} Đảng viên có Huy hiệu 40 tuổi Đảng trở lên</w:t>
       </w:r>
     </w:p>
     <w:p>
@@ -213,7 +213,7 @@
           <w:i w:val="0"/>
           <w:sz w:val="26"/>
         </w:rPr>
-        <w:t>☐ Người hoạt động cách mạng trước ngày 01/01/1945 (cán bộ lão thành cách mạng)</w:t>
+        <w:t>{{cremation_category_4_check}} Người hoạt động cách mạng trước ngày 01/01/1945 (cán bộ lão thành cách mạng)</w:t>
       </w:r>
     </w:p>
     <w:p>
@@ -223,7 +223,7 @@
           <w:i w:val="0"/>
           <w:sz w:val="26"/>
         </w:rPr>
-        <w:t>☐ Người hoạt động cách mạng từ ngày 01/01/1945 đến trước Tổng khởi nghĩa 19/8/1945 (Cán bộ tiền khởi nghĩa)</w:t>
+        <w:t>{{cremation_category_5_check}} Người hoạt động cách mạng từ ngày 01/01/1945 đến trước Tổng khởi nghĩa 19/8/1945 (Cán bộ tiền khởi nghĩa)</w:t>
       </w:r>
     </w:p>
     <w:p>
@@ -233,7 +233,7 @@
           <w:i w:val="0"/>
           <w:sz w:val="26"/>
         </w:rPr>
-        <w:t>☐ Thương binh, người hưởng chính sách như thương binh có tỷ lệ thương tật từ 81% trở lên</w:t>
+        <w:t>{{cremation_category_6_check}} Thương binh, người hưởng chính sách như thương binh có tỷ lệ thương tật từ 81% trở lên</w:t>
       </w:r>
     </w:p>
     <w:p>
@@ -243,7 +243,7 @@
           <w:i w:val="0"/>
           <w:sz w:val="26"/>
         </w:rPr>
-        <w:t>☐ Bệnh binh có tỷ lệ suy giảm khả năng lao động từ 81% trở lên</w:t>
+        <w:t>{{cremation_category_7_check}} Bệnh binh có tỷ lệ suy giảm khả năng lao động từ 81% trở lên</w:t>
       </w:r>
     </w:p>
     <w:p>
@@ -253,7 +253,7 @@
           <w:i w:val="0"/>
           <w:sz w:val="26"/>
         </w:rPr>
-        <w:t>☐ Người hoạt động kháng chiến bị nhiễm chất độc hóa học có tỷ lệ suy giảm khả năng lao động từ 81% trở lên</w:t>
+        <w:t>{{cremation_category_8_check}} Người hoạt động kháng chiến bị nhiễm chất độc hóa học có tỷ lệ suy giảm khả năng lao động từ 81% trở lên</w:t>
       </w:r>
     </w:p>
     <w:p>
@@ -263,7 +263,7 @@
           <w:i w:val="0"/>
           <w:sz w:val="26"/>
         </w:rPr>
-        <w:t>☐ Thân nhân liệt sĩ và người có công giúp đỡ cách mạng đang hưởng trợ cấp hàng tháng định suất nuôi dưỡng (già yếu, neo đơn)</w:t>
+        <w:t>{{cremation_category_9_check}} Thân nhân liệt sĩ và người có công giúp đỡ cách mạng đang hưởng trợ cấp hàng tháng định suất nuôi dưỡng (già yếu, neo đơn)</w:t>
       </w:r>
     </w:p>
     <w:p>
@@ -273,7 +273,7 @@
           <w:i w:val="0"/>
           <w:sz w:val="26"/>
         </w:rPr>
-        <w:t>☐ Các đối tượng chính sách đang được nuôi dưỡng tại Trung tâm dưỡng lão Thị Nghè</w:t>
+        <w:t>{{cremation_category_10_check}} Các đối tượng chính sách đang được nuôi dưỡng tại Trung tâm dưỡng lão Thị Nghè</w:t>
       </w:r>
     </w:p>
     <w:p>
@@ -283,7 +283,7 @@
           <w:i w:val="0"/>
           <w:sz w:val="26"/>
         </w:rPr>
-        <w:t>☐ Hộ nghèo (theo tiêu chí của Thành phố), mã số:…………………..</w:t>
+        <w:t>{{cremation_category_11_check}} Hộ nghèo (theo tiêu chí của Thành phố), mã số: {{cremation_poor_detail}}</w:t>
       </w:r>
     </w:p>
     <w:p>
@@ -293,7 +293,7 @@
           <w:i w:val="0"/>
           <w:sz w:val="26"/>
         </w:rPr>
-        <w:t>☐ Người khuyết tật (theo Nghị định số 28/2012/NĐ-CP)</w:t>
+        <w:t>{{cremation_category_12_check}} Người khuyết tật (theo Nghị định số 28/2012/NĐ-CP)</w:t>
       </w:r>
     </w:p>
     <w:p>
@@ -303,7 +303,7 @@
           <w:i w:val="0"/>
           <w:sz w:val="26"/>
         </w:rPr>
-        <w:t>☐ Người cao tuổi (theo Nghị định số 20/2021/NĐ-CP)</w:t>
+        <w:t>{{cremation_category_13_check}} Người cao tuổi (theo Nghị định số 20/2021/NĐ-CP)</w:t>
       </w:r>
     </w:p>
     <w:p>
@@ -313,7 +313,7 @@
           <w:i w:val="0"/>
           <w:sz w:val="26"/>
         </w:rPr>
-        <w:t>☐ Đối tượng bảo trợ xã hội khác (theo Nghị định số 67/2007/NĐ-CP, Nghị định số 13/2010/NĐ-CP hoặc Nghị định số 136/2013/NĐ-CP)</w:t>
+        <w:t>{{cremation_category_14_check}} Đối tượng bảo trợ xã hội khác (theo Nghị định số 67/2007/NĐ-CP, Nghị định số 13/2010/NĐ-CP hoặc Nghị định số 136/2013/NĐ-CP)</w:t>
       </w:r>
     </w:p>
     <w:p>
@@ -323,7 +323,7 @@
           <w:i w:val="0"/>
           <w:sz w:val="26"/>
         </w:rPr>
-        <w:t>☐ Đối tượng hưu trí</w:t>
+        <w:t>{{cremation_category_15_check}} Đối tượng hưu trí</w:t>
       </w:r>
     </w:p>
     <w:p>
@@ -333,7 +333,7 @@
           <w:i w:val="0"/>
           <w:sz w:val="26"/>
         </w:rPr>
-        <w:t>☐ Hộ cận nghèo (theo tiêu chí của Thành phố), mã số:………………….</w:t>
+        <w:t>{{cremation_category_16_check}} Hộ cận nghèo (theo tiêu chí của Thành phố), mã số: {{cremation_near_poor_detail}}</w:t>
       </w:r>
     </w:p>
     <w:p>
@@ -343,7 +343,7 @@
           <w:i w:val="0"/>
           <w:sz w:val="26"/>
         </w:rPr>
-        <w:t>☐ Người dân có hộ khẩu tại Thành phố Hồ Chí Minh</w:t>
+        <w:t>{{cremation_category_17_check}} Người dân có hộ khẩu tại Thành phố Hồ Chí Minh</w:t>
       </w:r>
     </w:p>
     <w:p>
@@ -353,7 +353,7 @@
           <w:i w:val="0"/>
           <w:sz w:val="26"/>
         </w:rPr>
-        <w:t>☐ Trẻ từ 6 tuổi trở xuống, có hộ khẩu tại Thành phố Hồ Chí Minh</w:t>
+        <w:t>{{cremation_category_18_check}} Trẻ từ 6 tuổi trở xuống, có hộ khẩu tại Thành phố Hồ Chí Minh</w:t>
       </w:r>
     </w:p>
     <w:p>
@@ -363,7 +363,7 @@
           <w:i w:val="0"/>
           <w:sz w:val="26"/>
         </w:rPr>
-        <w:t>☐ Trẻ từ 6 tuổi trở xuống, có tạm trú (KT3) tại Thành phố Hồ Chí Minh</w:t>
+        <w:t>{{cremation_category_19_check}} Trẻ từ 6 tuổi trở xuống, có tạm trú (KT3) tại Thành phố Hồ Chí Minh</w:t>
       </w:r>
     </w:p>
     <w:p>

</xml_diff>

<commit_message>
Fix cremation form to match official layout
</commit_message>
<xml_diff>
--- a/templates_word/ho_tro_hoa_tang.docx
+++ b/templates_word/ho_tro_hoa_tang.docx
@@ -4,598 +4,1418 @@
   <w:body>
     <w:p>
       <w:pPr>
+        <w:spacing w:before="0" w:after="0" w:line="240" w:lineRule="auto"/>
         <w:jc w:val="center"/>
       </w:pPr>
       <w:r>
         <w:rPr>
+          <w:rFonts w:ascii="Times New Roman" w:hAnsi="Times New Roman" w:eastAsia="Times New Roman"/>
           <w:b/>
-          <w:sz w:val="26"/>
+          <w:i w:val="0"/>
+          <w:sz w:val="24"/>
         </w:rPr>
         <w:t>CỘNG HÒA XÃ HỘI CHỦ NGHĨA VIỆT NAM</w:t>
-        <w:br/>
-        <w:t>Độc lập - Tự do - Hạnh phúc</w:t>
-        <w:br/>
-        <w:t>---------------</w:t>
       </w:r>
     </w:p>
     <w:p>
       <w:pPr>
+        <w:spacing w:before="0" w:after="160" w:line="240" w:lineRule="auto"/>
         <w:jc w:val="center"/>
       </w:pPr>
       <w:r>
         <w:rPr>
+          <w:rFonts w:ascii="Times New Roman" w:hAnsi="Times New Roman" w:eastAsia="Times New Roman"/>
           <w:b/>
           <w:i w:val="0"/>
-          <w:sz w:val="28"/>
+          <w:sz w:val="24"/>
+          <w:u w:val="single"/>
+        </w:rPr>
+        <w:t>Độc lập - Tự do - Hạnh phúc</w:t>
+      </w:r>
+    </w:p>
+    <w:p>
+      <w:pPr>
+        <w:spacing w:before="0" w:after="0" w:line="240" w:lineRule="auto"/>
+        <w:jc w:val="center"/>
+      </w:pPr>
+      <w:r>
+        <w:rPr>
+          <w:rFonts w:ascii="Times New Roman" w:hAnsi="Times New Roman" w:eastAsia="Times New Roman"/>
+          <w:b/>
+          <w:i w:val="0"/>
+          <w:sz w:val="26"/>
         </w:rPr>
         <w:t>TỜ KHAI THÔNG TIN GIA ĐÌNH, CÁ NHÂN, TỔ CHỨC</w:t>
-        <w:br/>
+      </w:r>
+    </w:p>
+    <w:p>
+      <w:pPr>
+        <w:spacing w:before="0" w:after="140" w:line="240" w:lineRule="auto"/>
+        <w:jc w:val="center"/>
+      </w:pPr>
+      <w:r>
+        <w:rPr>
+          <w:rFonts w:ascii="Times New Roman" w:hAnsi="Times New Roman" w:eastAsia="Times New Roman"/>
+          <w:b/>
+          <w:i w:val="0"/>
+          <w:sz w:val="26"/>
+        </w:rPr>
         <w:t>NHẬN CHI PHÍ HỖ TRỢ KHUYẾN KHÍCH HỎA TÁNG</w:t>
       </w:r>
     </w:p>
     <w:p>
       <w:pPr>
+        <w:spacing w:before="0" w:after="160" w:line="240" w:lineRule="auto"/>
         <w:jc w:val="center"/>
       </w:pPr>
       <w:r>
         <w:rPr>
+          <w:rFonts w:ascii="Times New Roman" w:hAnsi="Times New Roman" w:eastAsia="Times New Roman"/>
           <w:b w:val="0"/>
           <w:i w:val="0"/>
-          <w:sz w:val="26"/>
+          <w:sz w:val="24"/>
         </w:rPr>
         <w:t>Kính gửi: Ủy ban nhân dân Phường Minh Phụng, TP. Hồ Chí Minh</w:t>
       </w:r>
     </w:p>
     <w:p>
+      <w:pPr>
+        <w:spacing w:before="0" w:after="40" w:line="240" w:lineRule="auto"/>
+        <w:ind w:left="0"/>
+      </w:pPr>
       <w:r>
         <w:rPr>
+          <w:rFonts w:ascii="Times New Roman" w:hAnsi="Times New Roman" w:eastAsia="Times New Roman"/>
           <w:b w:val="0"/>
           <w:i w:val="0"/>
-          <w:sz w:val="26"/>
+          <w:sz w:val="24"/>
         </w:rPr>
-        <w:t>1. Tôi tên là: {{full_name}}</w:t>
+        <w:t xml:space="preserve">1. Tôi tên là: </w:t>
+      </w:r>
+      <w:r>
+        <w:rPr>
+          <w:rFonts w:ascii="Times New Roman" w:hAnsi="Times New Roman" w:eastAsia="Times New Roman"/>
+          <w:b/>
+          <w:i w:val="0"/>
+          <w:sz w:val="24"/>
+        </w:rPr>
+        <w:t>{{full_name}}</w:t>
       </w:r>
     </w:p>
     <w:p>
+      <w:pPr>
+        <w:tabs>
+          <w:tab w:pos="5102" w:val="left"/>
+        </w:tabs>
+        <w:spacing w:before="0" w:after="40" w:line="240" w:lineRule="auto"/>
+      </w:pPr>
       <w:r>
         <w:rPr>
+          <w:rFonts w:ascii="Times New Roman" w:hAnsi="Times New Roman" w:eastAsia="Times New Roman"/>
           <w:b w:val="0"/>
           <w:i w:val="0"/>
-          <w:sz w:val="26"/>
+          <w:sz w:val="24"/>
         </w:rPr>
-        <w:t>2. Ngày, tháng, năm sinh: {{date_of_birth}}</w:t>
+        <w:t xml:space="preserve">2. Ngày, tháng, năm sinh: </w:t>
+      </w:r>
+      <w:r>
+        <w:rPr>
+          <w:rFonts w:ascii="Times New Roman" w:hAnsi="Times New Roman" w:eastAsia="Times New Roman"/>
+          <w:b/>
+          <w:i w:val="0"/>
+          <w:sz w:val="24"/>
+        </w:rPr>
+        <w:t>{{date_of_birth}}</w:t>
+      </w:r>
+      <w:r>
+        <w:rPr>
+          <w:rFonts w:ascii="Times New Roman" w:hAnsi="Times New Roman" w:eastAsia="Times New Roman"/>
+          <w:b w:val="0"/>
+          <w:i w:val="0"/>
+          <w:sz w:val="24"/>
+        </w:rPr>
+        <w:tab/>
+        <w:t xml:space="preserve">3. CCCD số: </w:t>
+      </w:r>
+      <w:r>
+        <w:rPr>
+          <w:rFonts w:ascii="Times New Roman" w:hAnsi="Times New Roman" w:eastAsia="Times New Roman"/>
+          <w:b/>
+          <w:i w:val="0"/>
+          <w:sz w:val="24"/>
+        </w:rPr>
+        <w:t>{{citizen_id}}</w:t>
       </w:r>
     </w:p>
     <w:p>
+      <w:pPr>
+        <w:spacing w:before="0" w:after="40" w:line="240" w:lineRule="auto"/>
+        <w:ind w:left="0"/>
+      </w:pPr>
       <w:r>
         <w:rPr>
+          <w:rFonts w:ascii="Times New Roman" w:hAnsi="Times New Roman" w:eastAsia="Times New Roman"/>
           <w:b w:val="0"/>
           <w:i w:val="0"/>
-          <w:sz w:val="26"/>
+          <w:sz w:val="24"/>
         </w:rPr>
-        <w:t>3. CCCD số: {{citizen_id}}</w:t>
+        <w:t xml:space="preserve">4. Hộ khẩu thường trú: </w:t>
+      </w:r>
+      <w:r>
+        <w:rPr>
+          <w:rFonts w:ascii="Times New Roman" w:hAnsi="Times New Roman" w:eastAsia="Times New Roman"/>
+          <w:b/>
+          <w:i w:val="0"/>
+          <w:sz w:val="24"/>
+        </w:rPr>
+        <w:t>{{residence_address}}</w:t>
       </w:r>
     </w:p>
     <w:p>
+      <w:pPr>
+        <w:tabs>
+          <w:tab w:pos="5216" w:val="left"/>
+        </w:tabs>
+        <w:spacing w:before="0" w:after="40" w:line="240" w:lineRule="auto"/>
+        <w:ind w:left="283"/>
+      </w:pPr>
       <w:r>
         <w:rPr>
+          <w:rFonts w:ascii="Times New Roman" w:hAnsi="Times New Roman" w:eastAsia="Times New Roman"/>
           <w:b w:val="0"/>
           <w:i w:val="0"/>
-          <w:sz w:val="26"/>
+          <w:sz w:val="24"/>
         </w:rPr>
-        <w:t>4. Hộ khẩu thường trú: {{residence_address}}</w:t>
+        <w:t xml:space="preserve">Số Tài khoản: </w:t>
+      </w:r>
+      <w:r>
+        <w:rPr>
+          <w:rFonts w:ascii="Times New Roman" w:hAnsi="Times New Roman" w:eastAsia="Times New Roman"/>
+          <w:b/>
+          <w:i w:val="0"/>
+          <w:sz w:val="24"/>
+        </w:rPr>
+        <w:t>{{bank_account_number}}</w:t>
+      </w:r>
+      <w:r>
+        <w:rPr>
+          <w:rFonts w:ascii="Times New Roman" w:hAnsi="Times New Roman" w:eastAsia="Times New Roman"/>
+          <w:b w:val="0"/>
+          <w:i w:val="0"/>
+          <w:sz w:val="24"/>
+        </w:rPr>
+        <w:tab/>
+        <w:t xml:space="preserve">Ngân hàng: </w:t>
+      </w:r>
+      <w:r>
+        <w:rPr>
+          <w:rFonts w:ascii="Times New Roman" w:hAnsi="Times New Roman" w:eastAsia="Times New Roman"/>
+          <w:b/>
+          <w:i w:val="0"/>
+          <w:sz w:val="24"/>
+        </w:rPr>
+        <w:t>{{bank_name}}</w:t>
       </w:r>
     </w:p>
     <w:p>
+      <w:pPr>
+        <w:spacing w:before="0" w:after="40" w:line="240" w:lineRule="auto"/>
+        <w:ind w:left="283"/>
+      </w:pPr>
       <w:r>
         <w:rPr>
+          <w:rFonts w:ascii="Times New Roman" w:hAnsi="Times New Roman" w:eastAsia="Times New Roman"/>
           <w:b w:val="0"/>
           <w:i w:val="0"/>
-          <w:sz w:val="26"/>
+          <w:sz w:val="24"/>
         </w:rPr>
-        <w:t>Số Tài khoản: {{bank_account_number}}</w:t>
+        <w:t xml:space="preserve">Số điện thoại: </w:t>
+      </w:r>
+      <w:r>
+        <w:rPr>
+          <w:rFonts w:ascii="Times New Roman" w:hAnsi="Times New Roman" w:eastAsia="Times New Roman"/>
+          <w:b/>
+          <w:i w:val="0"/>
+          <w:sz w:val="24"/>
+        </w:rPr>
+        <w:t>{{phone_number}}</w:t>
       </w:r>
     </w:p>
     <w:p>
+      <w:pPr>
+        <w:spacing w:before="0" w:after="40" w:line="240" w:lineRule="auto"/>
+        <w:ind w:left="0"/>
+      </w:pPr>
       <w:r>
         <w:rPr>
+          <w:rFonts w:ascii="Times New Roman" w:hAnsi="Times New Roman" w:eastAsia="Times New Roman"/>
           <w:b w:val="0"/>
           <w:i w:val="0"/>
-          <w:sz w:val="26"/>
+          <w:sz w:val="24"/>
         </w:rPr>
-        <w:t>Ngân hàng: {{bank_name}}</w:t>
+        <w:t xml:space="preserve">5. Quan hệ với người mất: </w:t>
+      </w:r>
+      <w:r>
+        <w:rPr>
+          <w:rFonts w:ascii="Times New Roman" w:hAnsi="Times New Roman" w:eastAsia="Times New Roman"/>
+          <w:b/>
+          <w:i w:val="0"/>
+          <w:sz w:val="24"/>
+        </w:rPr>
+        <w:t>{{deceased_relationship}}</w:t>
       </w:r>
     </w:p>
     <w:p>
+      <w:pPr>
+        <w:spacing w:before="0" w:after="40" w:line="240" w:lineRule="auto"/>
+        <w:ind w:left="283"/>
+      </w:pPr>
       <w:r>
         <w:rPr>
+          <w:rFonts w:ascii="Times New Roman" w:hAnsi="Times New Roman" w:eastAsia="Times New Roman"/>
           <w:b w:val="0"/>
           <w:i w:val="0"/>
-          <w:sz w:val="26"/>
+          <w:sz w:val="24"/>
         </w:rPr>
-        <w:t>Số điện thoại: {{phone_number}}</w:t>
+        <w:t xml:space="preserve">Hoặc đại diện cho tổ chức (nếu có): </w:t>
+      </w:r>
+      <w:r>
+        <w:rPr>
+          <w:rFonts w:ascii="Times New Roman" w:hAnsi="Times New Roman" w:eastAsia="Times New Roman"/>
+          <w:b/>
+          <w:i w:val="0"/>
+          <w:sz w:val="24"/>
+        </w:rPr>
+        <w:t>{{org_name}}</w:t>
       </w:r>
     </w:p>
     <w:p>
+      <w:pPr>
+        <w:spacing w:before="0" w:after="40" w:line="240" w:lineRule="auto"/>
+        <w:ind w:left="0"/>
+      </w:pPr>
       <w:r>
         <w:rPr>
+          <w:rFonts w:ascii="Times New Roman" w:hAnsi="Times New Roman" w:eastAsia="Times New Roman"/>
           <w:b w:val="0"/>
           <w:i w:val="0"/>
-          <w:sz w:val="26"/>
+          <w:sz w:val="24"/>
         </w:rPr>
-        <w:t>5. Quan hệ với người mất: {{deceased_relationship}}</w:t>
+        <w:t xml:space="preserve">6. Họ và tên người mất: </w:t>
+      </w:r>
+      <w:r>
+        <w:rPr>
+          <w:rFonts w:ascii="Times New Roman" w:hAnsi="Times New Roman" w:eastAsia="Times New Roman"/>
+          <w:b/>
+          <w:i w:val="0"/>
+          <w:sz w:val="24"/>
+        </w:rPr>
+        <w:t>{{deceased_full_name}}</w:t>
       </w:r>
     </w:p>
     <w:p>
+      <w:pPr>
+        <w:spacing w:before="0" w:after="40" w:line="240" w:lineRule="auto"/>
+        <w:ind w:left="0"/>
+      </w:pPr>
       <w:r>
         <w:rPr>
+          <w:rFonts w:ascii="Times New Roman" w:hAnsi="Times New Roman" w:eastAsia="Times New Roman"/>
           <w:b w:val="0"/>
           <w:i w:val="0"/>
-          <w:sz w:val="26"/>
+          <w:sz w:val="24"/>
         </w:rPr>
-        <w:t>Hoặc đại diện cho tổ chức (nếu có): {{org_name}}</w:t>
+        <w:t xml:space="preserve">7. Đã từ trần ngày: </w:t>
+      </w:r>
+      <w:r>
+        <w:rPr>
+          <w:rFonts w:ascii="Times New Roman" w:hAnsi="Times New Roman" w:eastAsia="Times New Roman"/>
+          <w:b/>
+          <w:i w:val="0"/>
+          <w:sz w:val="24"/>
+        </w:rPr>
+        <w:t>{{deceased_death_date}}</w:t>
       </w:r>
     </w:p>
     <w:p>
+      <w:pPr>
+        <w:spacing w:before="0" w:after="40" w:line="240" w:lineRule="auto"/>
+        <w:ind w:left="312"/>
+      </w:pPr>
       <w:r>
         <w:rPr>
+          <w:rFonts w:ascii="Times New Roman" w:hAnsi="Times New Roman" w:eastAsia="Times New Roman"/>
           <w:b w:val="0"/>
           <w:i w:val="0"/>
-          <w:sz w:val="26"/>
+          <w:sz w:val="24"/>
         </w:rPr>
-        <w:t>6. Họ và tên người mất: {{deceased_full_name}}</w:t>
+        <w:t xml:space="preserve">(Giấy chứng tử số: </w:t>
+      </w:r>
+      <w:r>
+        <w:rPr>
+          <w:rFonts w:ascii="Times New Roman" w:hAnsi="Times New Roman" w:eastAsia="Times New Roman"/>
+          <w:b/>
+          <w:i w:val="0"/>
+          <w:sz w:val="24"/>
+        </w:rPr>
+        <w:t>{{death_certificate_number}}</w:t>
+      </w:r>
+      <w:r>
+        <w:rPr>
+          <w:rFonts w:ascii="Times New Roman" w:hAnsi="Times New Roman" w:eastAsia="Times New Roman"/>
+          <w:b w:val="0"/>
+          <w:i w:val="0"/>
+          <w:sz w:val="24"/>
+        </w:rPr>
+        <w:t xml:space="preserve"> ngày </w:t>
+      </w:r>
+      <w:r>
+        <w:rPr>
+          <w:rFonts w:ascii="Times New Roman" w:hAnsi="Times New Roman" w:eastAsia="Times New Roman"/>
+          <w:b/>
+          <w:i w:val="0"/>
+          <w:sz w:val="24"/>
+        </w:rPr>
+        <w:t>{{death_certificate_date}}</w:t>
+      </w:r>
+      <w:r>
+        <w:rPr>
+          <w:rFonts w:ascii="Times New Roman" w:hAnsi="Times New Roman" w:eastAsia="Times New Roman"/>
+          <w:b w:val="0"/>
+          <w:i w:val="0"/>
+          <w:sz w:val="24"/>
+        </w:rPr>
+        <w:t xml:space="preserve"> do </w:t>
+      </w:r>
+      <w:r>
+        <w:rPr>
+          <w:rFonts w:ascii="Times New Roman" w:hAnsi="Times New Roman" w:eastAsia="Times New Roman"/>
+          <w:b/>
+          <w:i w:val="0"/>
+          <w:sz w:val="24"/>
+        </w:rPr>
+        <w:t>{{death_certificate_issuer}}</w:t>
+      </w:r>
+      <w:r>
+        <w:rPr>
+          <w:rFonts w:ascii="Times New Roman" w:hAnsi="Times New Roman" w:eastAsia="Times New Roman"/>
+          <w:b w:val="0"/>
+          <w:i w:val="0"/>
+          <w:sz w:val="24"/>
+        </w:rPr>
+        <w:t xml:space="preserve"> cấp)</w:t>
       </w:r>
     </w:p>
     <w:p>
+      <w:pPr>
+        <w:spacing w:before="0" w:after="20" w:line="240" w:lineRule="auto"/>
+        <w:ind w:left="567"/>
+      </w:pPr>
       <w:r>
         <w:rPr>
+          <w:rFonts w:ascii="Times New Roman" w:hAnsi="Times New Roman" w:eastAsia="Times New Roman"/>
           <w:b w:val="0"/>
           <w:i w:val="0"/>
-          <w:sz w:val="26"/>
-        </w:rPr>
-        <w:t>7. Đã từ trần ngày: {{deceased_death_date}}</w:t>
-      </w:r>
-    </w:p>
-    <w:p>
-      <w:r>
-        <w:rPr>
-          <w:b w:val="0"/>
-          <w:i/>
-          <w:sz w:val="26"/>
-        </w:rPr>
-        <w:t>(Giấy chứng tử số: {{death_certificate_number}}, ngày {{death_certificate_date}}, do {{death_certificate_issuer}} cấp)</w:t>
-      </w:r>
-    </w:p>
-    <w:p>
-      <w:r>
-        <w:rPr>
-          <w:b/>
-          <w:i w:val="0"/>
-          <w:sz w:val="26"/>
+          <w:sz w:val="24"/>
         </w:rPr>
         <w:t>8. Thuộc đối tượng:</w:t>
       </w:r>
     </w:p>
     <w:p>
+      <w:pPr>
+        <w:tabs>
+          <w:tab w:pos="8929" w:val="right"/>
+        </w:tabs>
+        <w:spacing w:before="0" w:after="0" w:line="240" w:lineRule="auto"/>
+        <w:ind w:left="765" w:hanging="198"/>
+      </w:pPr>
       <w:r>
         <w:rPr>
+          <w:rFonts w:ascii="Times New Roman" w:hAnsi="Times New Roman" w:eastAsia="Times New Roman"/>
           <w:b w:val="0"/>
           <w:i w:val="0"/>
-          <w:sz w:val="26"/>
+          <w:sz w:val="24"/>
         </w:rPr>
-        <w:t>{{cremation_category_1_check}} Bà mẹ Việt Nam anh hùng</w:t>
+        <w:t>- Bà mẹ Việt Nam anh hùng</w:t>
+      </w:r>
+      <w:r>
+        <w:rPr>
+          <w:rFonts w:ascii="Times New Roman" w:hAnsi="Times New Roman" w:eastAsia="Times New Roman"/>
+          <w:b w:val="0"/>
+          <w:i w:val="0"/>
+          <w:sz w:val="24"/>
+        </w:rPr>
+        <w:tab/>
+        <w:t>{{cremation_category_1_check}}</w:t>
       </w:r>
     </w:p>
     <w:p>
+      <w:pPr>
+        <w:tabs>
+          <w:tab w:pos="8929" w:val="right"/>
+        </w:tabs>
+        <w:spacing w:before="0" w:after="0" w:line="240" w:lineRule="auto"/>
+        <w:ind w:left="765" w:hanging="198"/>
+      </w:pPr>
       <w:r>
         <w:rPr>
+          <w:rFonts w:ascii="Times New Roman" w:hAnsi="Times New Roman" w:eastAsia="Times New Roman"/>
           <w:b w:val="0"/>
           <w:i w:val="0"/>
-          <w:sz w:val="26"/>
+          <w:sz w:val="24"/>
         </w:rPr>
-        <w:t>{{cremation_category_2_check}} Anh hùng lực lượng vũ trang nhân dân, anh hùng lao động</w:t>
+        <w:t>- Anh hùng lực lượng vũ trang nhân dân, anh hùng lao động</w:t>
+      </w:r>
+      <w:r>
+        <w:rPr>
+          <w:rFonts w:ascii="Times New Roman" w:hAnsi="Times New Roman" w:eastAsia="Times New Roman"/>
+          <w:b w:val="0"/>
+          <w:i w:val="0"/>
+          <w:sz w:val="24"/>
+        </w:rPr>
+        <w:tab/>
+        <w:t>{{cremation_category_2_check}}</w:t>
       </w:r>
     </w:p>
     <w:p>
+      <w:pPr>
+        <w:tabs>
+          <w:tab w:pos="8929" w:val="right"/>
+        </w:tabs>
+        <w:spacing w:before="0" w:after="0" w:line="240" w:lineRule="auto"/>
+        <w:ind w:left="765" w:hanging="198"/>
+      </w:pPr>
       <w:r>
         <w:rPr>
+          <w:rFonts w:ascii="Times New Roman" w:hAnsi="Times New Roman" w:eastAsia="Times New Roman"/>
           <w:b w:val="0"/>
           <w:i w:val="0"/>
-          <w:sz w:val="26"/>
+          <w:sz w:val="24"/>
         </w:rPr>
-        <w:t>{{cremation_category_3_check}} Đảng viên có Huy hiệu 40 tuổi Đảng trở lên</w:t>
+        <w:t>- Đảng viên có Huy hiệu 40 tuổi Đảng trở lên</w:t>
+      </w:r>
+      <w:r>
+        <w:rPr>
+          <w:rFonts w:ascii="Times New Roman" w:hAnsi="Times New Roman" w:eastAsia="Times New Roman"/>
+          <w:b w:val="0"/>
+          <w:i w:val="0"/>
+          <w:sz w:val="24"/>
+        </w:rPr>
+        <w:tab/>
+        <w:t>{{cremation_category_3_check}}</w:t>
       </w:r>
     </w:p>
     <w:p>
+      <w:pPr>
+        <w:tabs>
+          <w:tab w:pos="8929" w:val="right"/>
+        </w:tabs>
+        <w:spacing w:before="0" w:after="0" w:line="240" w:lineRule="auto"/>
+        <w:ind w:left="765" w:hanging="198"/>
+      </w:pPr>
       <w:r>
         <w:rPr>
+          <w:rFonts w:ascii="Times New Roman" w:hAnsi="Times New Roman" w:eastAsia="Times New Roman"/>
           <w:b w:val="0"/>
           <w:i w:val="0"/>
-          <w:sz w:val="26"/>
+          <w:sz w:val="24"/>
         </w:rPr>
-        <w:t>{{cremation_category_4_check}} Người hoạt động cách mạng trước ngày 01/01/1945 (cán bộ lão thành cách mạng)</w:t>
+        <w:t>- Người hoạt động cách mạng trước ngày 01/01/1945</w:t>
+        <w:br/>
+        <w:t>(cán bộ lão thành cách mạng)</w:t>
+      </w:r>
+      <w:r>
+        <w:rPr>
+          <w:rFonts w:ascii="Times New Roman" w:hAnsi="Times New Roman" w:eastAsia="Times New Roman"/>
+          <w:b w:val="0"/>
+          <w:i w:val="0"/>
+          <w:sz w:val="24"/>
+        </w:rPr>
+        <w:tab/>
+        <w:t>{{cremation_category_4_check}}</w:t>
       </w:r>
     </w:p>
     <w:p>
+      <w:pPr>
+        <w:tabs>
+          <w:tab w:pos="8929" w:val="right"/>
+        </w:tabs>
+        <w:spacing w:before="0" w:after="0" w:line="240" w:lineRule="auto"/>
+        <w:ind w:left="765" w:hanging="198"/>
+      </w:pPr>
       <w:r>
         <w:rPr>
+          <w:rFonts w:ascii="Times New Roman" w:hAnsi="Times New Roman" w:eastAsia="Times New Roman"/>
           <w:b w:val="0"/>
           <w:i w:val="0"/>
-          <w:sz w:val="26"/>
+          <w:sz w:val="24"/>
         </w:rPr>
-        <w:t>{{cremation_category_5_check}} Người hoạt động cách mạng từ ngày 01/01/1945 đến trước Tổng khởi nghĩa 19/8/1945 (Cán bộ tiền khởi nghĩa)</w:t>
+        <w:t>- Người hoạt động cách mạng từ ngày 01/01/1945</w:t>
+        <w:br/>
+        <w:t>đến trước Tổng khởi nghĩa 19/8/1945 (Cán bộ tiền khởi nghĩa)</w:t>
+      </w:r>
+      <w:r>
+        <w:rPr>
+          <w:rFonts w:ascii="Times New Roman" w:hAnsi="Times New Roman" w:eastAsia="Times New Roman"/>
+          <w:b w:val="0"/>
+          <w:i w:val="0"/>
+          <w:sz w:val="24"/>
+        </w:rPr>
+        <w:tab/>
+        <w:t>{{cremation_category_5_check}}</w:t>
       </w:r>
     </w:p>
     <w:p>
+      <w:pPr>
+        <w:tabs>
+          <w:tab w:pos="8929" w:val="right"/>
+        </w:tabs>
+        <w:spacing w:before="0" w:after="0" w:line="240" w:lineRule="auto"/>
+        <w:ind w:left="765" w:hanging="198"/>
+      </w:pPr>
       <w:r>
         <w:rPr>
+          <w:rFonts w:ascii="Times New Roman" w:hAnsi="Times New Roman" w:eastAsia="Times New Roman"/>
           <w:b w:val="0"/>
           <w:i w:val="0"/>
-          <w:sz w:val="26"/>
+          <w:sz w:val="24"/>
         </w:rPr>
-        <w:t>{{cremation_category_6_check}} Thương binh, người hưởng chính sách như thương binh có tỷ lệ thương tật từ 81% trở lên</w:t>
+        <w:t>- Thương binh, người hưởng chính sách như thương binh</w:t>
+        <w:br/>
+        <w:t>có tỷ lệ thương tật từ 81% trở lên</w:t>
+      </w:r>
+      <w:r>
+        <w:rPr>
+          <w:rFonts w:ascii="Times New Roman" w:hAnsi="Times New Roman" w:eastAsia="Times New Roman"/>
+          <w:b w:val="0"/>
+          <w:i w:val="0"/>
+          <w:sz w:val="24"/>
+        </w:rPr>
+        <w:tab/>
+        <w:t>{{cremation_category_6_check}}</w:t>
       </w:r>
     </w:p>
     <w:p>
+      <w:pPr>
+        <w:tabs>
+          <w:tab w:pos="8929" w:val="right"/>
+        </w:tabs>
+        <w:spacing w:before="0" w:after="0" w:line="240" w:lineRule="auto"/>
+        <w:ind w:left="765" w:hanging="198"/>
+      </w:pPr>
       <w:r>
         <w:rPr>
+          <w:rFonts w:ascii="Times New Roman" w:hAnsi="Times New Roman" w:eastAsia="Times New Roman"/>
           <w:b w:val="0"/>
           <w:i w:val="0"/>
-          <w:sz w:val="26"/>
+          <w:sz w:val="24"/>
         </w:rPr>
-        <w:t>{{cremation_category_7_check}} Bệnh binh có tỷ lệ suy giảm khả năng lao động từ 81% trở lên</w:t>
+        <w:t>- Bệnh binh có tỷ lệ suy giảm khả năng lao động từ 81% trở lên</w:t>
+      </w:r>
+      <w:r>
+        <w:rPr>
+          <w:rFonts w:ascii="Times New Roman" w:hAnsi="Times New Roman" w:eastAsia="Times New Roman"/>
+          <w:b w:val="0"/>
+          <w:i w:val="0"/>
+          <w:sz w:val="24"/>
+        </w:rPr>
+        <w:tab/>
+        <w:t>{{cremation_category_7_check}}</w:t>
       </w:r>
     </w:p>
     <w:p>
+      <w:pPr>
+        <w:tabs>
+          <w:tab w:pos="8929" w:val="right"/>
+        </w:tabs>
+        <w:spacing w:before="0" w:after="0" w:line="240" w:lineRule="auto"/>
+        <w:ind w:left="765" w:hanging="198"/>
+      </w:pPr>
       <w:r>
         <w:rPr>
+          <w:rFonts w:ascii="Times New Roman" w:hAnsi="Times New Roman" w:eastAsia="Times New Roman"/>
           <w:b w:val="0"/>
           <w:i w:val="0"/>
-          <w:sz w:val="26"/>
+          <w:sz w:val="24"/>
         </w:rPr>
-        <w:t>{{cremation_category_8_check}} Người hoạt động kháng chiến bị nhiễm chất độc hóa học có tỷ lệ suy giảm khả năng lao động từ 81% trở lên</w:t>
+        <w:t>- Người hoạt động kháng chiến bị nhiễm chất độc hóa học</w:t>
+        <w:br/>
+        <w:t>có tỷ lệ suy giảm khả năng lao động từ 81% trở lên</w:t>
+      </w:r>
+      <w:r>
+        <w:rPr>
+          <w:rFonts w:ascii="Times New Roman" w:hAnsi="Times New Roman" w:eastAsia="Times New Roman"/>
+          <w:b w:val="0"/>
+          <w:i w:val="0"/>
+          <w:sz w:val="24"/>
+        </w:rPr>
+        <w:tab/>
+        <w:t>{{cremation_category_8_check}}</w:t>
       </w:r>
     </w:p>
     <w:p>
+      <w:pPr>
+        <w:tabs>
+          <w:tab w:pos="8929" w:val="right"/>
+        </w:tabs>
+        <w:spacing w:before="0" w:after="0" w:line="240" w:lineRule="auto"/>
+        <w:ind w:left="765" w:hanging="198"/>
+      </w:pPr>
       <w:r>
         <w:rPr>
+          <w:rFonts w:ascii="Times New Roman" w:hAnsi="Times New Roman" w:eastAsia="Times New Roman"/>
           <w:b w:val="0"/>
           <w:i w:val="0"/>
-          <w:sz w:val="26"/>
+          <w:sz w:val="24"/>
         </w:rPr>
-        <w:t>{{cremation_category_9_check}} Thân nhân liệt sĩ và người có công giúp đỡ cách mạng đang hưởng trợ cấp hàng tháng định suất nuôi dưỡng (già yếu, neo đơn)</w:t>
+        <w:t>- Thân nhân liệt sĩ và người có công giúp đỡ cách mạng đang hưởng</w:t>
+        <w:br/>
+        <w:t>trợ cấp hàng tháng định suất nuôi dưỡng (già yếu, neo đơn)</w:t>
+      </w:r>
+      <w:r>
+        <w:rPr>
+          <w:rFonts w:ascii="Times New Roman" w:hAnsi="Times New Roman" w:eastAsia="Times New Roman"/>
+          <w:b w:val="0"/>
+          <w:i w:val="0"/>
+          <w:sz w:val="24"/>
+        </w:rPr>
+        <w:tab/>
+        <w:t>{{cremation_category_9_check}}</w:t>
       </w:r>
     </w:p>
     <w:p>
+      <w:pPr>
+        <w:tabs>
+          <w:tab w:pos="8929" w:val="right"/>
+        </w:tabs>
+        <w:spacing w:before="0" w:after="0" w:line="240" w:lineRule="auto"/>
+        <w:ind w:left="765" w:hanging="198"/>
+      </w:pPr>
       <w:r>
         <w:rPr>
+          <w:rFonts w:ascii="Times New Roman" w:hAnsi="Times New Roman" w:eastAsia="Times New Roman"/>
           <w:b w:val="0"/>
           <w:i w:val="0"/>
-          <w:sz w:val="26"/>
+          <w:sz w:val="24"/>
         </w:rPr>
-        <w:t>{{cremation_category_10_check}} Các đối tượng chính sách đang được nuôi dưỡng tại Trung tâm dưỡng lão Thị Nghè</w:t>
+        <w:t>- Các đối tượng chính sách đang được nuôi dưỡng</w:t>
+        <w:br/>
+        <w:t>tại Trung tâm dưỡng lão Thị Nghè</w:t>
+      </w:r>
+      <w:r>
+        <w:rPr>
+          <w:rFonts w:ascii="Times New Roman" w:hAnsi="Times New Roman" w:eastAsia="Times New Roman"/>
+          <w:b w:val="0"/>
+          <w:i w:val="0"/>
+          <w:sz w:val="24"/>
+        </w:rPr>
+        <w:tab/>
+        <w:t>{{cremation_category_10_check}}</w:t>
       </w:r>
     </w:p>
     <w:p>
+      <w:pPr>
+        <w:tabs>
+          <w:tab w:pos="8929" w:val="right"/>
+        </w:tabs>
+        <w:spacing w:before="0" w:after="0" w:line="240" w:lineRule="auto"/>
+        <w:ind w:left="765" w:hanging="198"/>
+      </w:pPr>
       <w:r>
         <w:rPr>
+          <w:rFonts w:ascii="Times New Roman" w:hAnsi="Times New Roman" w:eastAsia="Times New Roman"/>
           <w:b w:val="0"/>
           <w:i w:val="0"/>
-          <w:sz w:val="26"/>
+          <w:sz w:val="24"/>
         </w:rPr>
-        <w:t>{{cremation_category_11_check}} Hộ nghèo (theo tiêu chí của Thành phố), mã số: {{cremation_poor_detail}}</w:t>
+        <w:t>- Hộ nghèo (theo tiêu chí của Thành phố), mã số: {{cremation_poor_detail}}</w:t>
+      </w:r>
+      <w:r>
+        <w:rPr>
+          <w:rFonts w:ascii="Times New Roman" w:hAnsi="Times New Roman" w:eastAsia="Times New Roman"/>
+          <w:b w:val="0"/>
+          <w:i w:val="0"/>
+          <w:sz w:val="24"/>
+        </w:rPr>
+        <w:tab/>
+        <w:t>{{cremation_category_11_check}}</w:t>
       </w:r>
     </w:p>
     <w:p>
+      <w:pPr>
+        <w:spacing w:before="0" w:after="0" w:line="240" w:lineRule="auto"/>
+        <w:ind w:left="567"/>
+      </w:pPr>
       <w:r>
         <w:rPr>
+          <w:rFonts w:ascii="Times New Roman" w:hAnsi="Times New Roman" w:eastAsia="Times New Roman"/>
           <w:b w:val="0"/>
           <w:i w:val="0"/>
-          <w:sz w:val="26"/>
+          <w:sz w:val="24"/>
         </w:rPr>
-        <w:t>{{cremation_category_12_check}} Người khuyết tật (theo Nghị định số 28/2012/NĐ-CP)</w:t>
+        <w:t>- Các đối tượng đang hưởng trợ cấp xã hội hàng tháng tại phường:</w:t>
       </w:r>
     </w:p>
     <w:p>
+      <w:pPr>
+        <w:tabs>
+          <w:tab w:pos="8929" w:val="right"/>
+        </w:tabs>
+        <w:spacing w:before="0" w:after="0" w:line="240" w:lineRule="auto"/>
+        <w:ind w:left="964" w:hanging="198"/>
+      </w:pPr>
       <w:r>
         <w:rPr>
+          <w:rFonts w:ascii="Times New Roman" w:hAnsi="Times New Roman" w:eastAsia="Times New Roman"/>
           <w:b w:val="0"/>
           <w:i w:val="0"/>
-          <w:sz w:val="26"/>
+          <w:sz w:val="24"/>
         </w:rPr>
-        <w:t>{{cremation_category_13_check}} Người cao tuổi (theo Nghị định số 20/2021/NĐ-CP)</w:t>
+        <w:t>• Người khuyết tật (theo Nghị định số 28/2012/NĐ-CP)</w:t>
+      </w:r>
+      <w:r>
+        <w:rPr>
+          <w:rFonts w:ascii="Times New Roman" w:hAnsi="Times New Roman" w:eastAsia="Times New Roman"/>
+          <w:b w:val="0"/>
+          <w:i w:val="0"/>
+          <w:sz w:val="24"/>
+        </w:rPr>
+        <w:tab/>
+        <w:t>{{cremation_category_12_check}}</w:t>
       </w:r>
     </w:p>
     <w:p>
+      <w:pPr>
+        <w:spacing w:before="0" w:after="0" w:line="240" w:lineRule="auto"/>
+      </w:pPr>
       <w:r>
-        <w:rPr>
-          <w:b w:val="0"/>
-          <w:i w:val="0"/>
-          <w:sz w:val="26"/>
-        </w:rPr>
-        <w:t>{{cremation_category_14_check}} Đối tượng bảo trợ xã hội khác (theo Nghị định số 67/2007/NĐ-CP, Nghị định số 13/2010/NĐ-CP hoặc Nghị định số 136/2013/NĐ-CP)</w:t>
+        <w:br w:type="page"/>
       </w:r>
     </w:p>
     <w:p>
+      <w:pPr>
+        <w:tabs>
+          <w:tab w:pos="8929" w:val="right"/>
+        </w:tabs>
+        <w:spacing w:before="0" w:after="0" w:line="240" w:lineRule="auto"/>
+        <w:ind w:left="964" w:hanging="198"/>
+      </w:pPr>
       <w:r>
         <w:rPr>
+          <w:rFonts w:ascii="Times New Roman" w:hAnsi="Times New Roman" w:eastAsia="Times New Roman"/>
           <w:b w:val="0"/>
           <w:i w:val="0"/>
-          <w:sz w:val="26"/>
+          <w:sz w:val="24"/>
         </w:rPr>
-        <w:t>{{cremation_category_15_check}} Đối tượng hưu trí</w:t>
+        <w:t>• Người cao tuổi (theo Nghị định số 20/2021/NĐ-CP)</w:t>
+      </w:r>
+      <w:r>
+        <w:rPr>
+          <w:rFonts w:ascii="Times New Roman" w:hAnsi="Times New Roman" w:eastAsia="Times New Roman"/>
+          <w:b w:val="0"/>
+          <w:i w:val="0"/>
+          <w:sz w:val="24"/>
+        </w:rPr>
+        <w:tab/>
+        <w:t>{{cremation_category_13_check}}</w:t>
       </w:r>
     </w:p>
     <w:p>
+      <w:pPr>
+        <w:tabs>
+          <w:tab w:pos="8929" w:val="right"/>
+        </w:tabs>
+        <w:spacing w:before="0" w:after="0" w:line="240" w:lineRule="auto"/>
+        <w:ind w:left="964" w:hanging="198"/>
+      </w:pPr>
       <w:r>
         <w:rPr>
+          <w:rFonts w:ascii="Times New Roman" w:hAnsi="Times New Roman" w:eastAsia="Times New Roman"/>
           <w:b w:val="0"/>
           <w:i w:val="0"/>
-          <w:sz w:val="26"/>
+          <w:sz w:val="24"/>
         </w:rPr>
-        <w:t>{{cremation_category_16_check}} Hộ cận nghèo (theo tiêu chí của Thành phố), mã số: {{cremation_near_poor_detail}}</w:t>
+        <w:t>• Đối tượng bảo trợ xã hội khác (theo Nghị định số 67/2007/NĐ-CP,</w:t>
+        <w:br/>
+        <w:t>Nghị định số 13/2010/NĐ-CP hoặc Nghị định số 136/2013/NĐ-CP)</w:t>
+      </w:r>
+      <w:r>
+        <w:rPr>
+          <w:rFonts w:ascii="Times New Roman" w:hAnsi="Times New Roman" w:eastAsia="Times New Roman"/>
+          <w:b w:val="0"/>
+          <w:i w:val="0"/>
+          <w:sz w:val="24"/>
+        </w:rPr>
+        <w:tab/>
+        <w:t>{{cremation_category_14_check}}</w:t>
       </w:r>
     </w:p>
     <w:p>
+      <w:pPr>
+        <w:tabs>
+          <w:tab w:pos="8929" w:val="right"/>
+        </w:tabs>
+        <w:spacing w:before="0" w:after="0" w:line="240" w:lineRule="auto"/>
+        <w:ind w:left="765" w:hanging="198"/>
+      </w:pPr>
       <w:r>
         <w:rPr>
+          <w:rFonts w:ascii="Times New Roman" w:hAnsi="Times New Roman" w:eastAsia="Times New Roman"/>
           <w:b w:val="0"/>
           <w:i w:val="0"/>
-          <w:sz w:val="26"/>
+          <w:sz w:val="24"/>
         </w:rPr>
-        <w:t>{{cremation_category_17_check}} Người dân có hộ khẩu tại Thành phố Hồ Chí Minh</w:t>
+        <w:t>- Đối tượng hưu trí</w:t>
+      </w:r>
+      <w:r>
+        <w:rPr>
+          <w:rFonts w:ascii="Times New Roman" w:hAnsi="Times New Roman" w:eastAsia="Times New Roman"/>
+          <w:b w:val="0"/>
+          <w:i w:val="0"/>
+          <w:sz w:val="24"/>
+        </w:rPr>
+        <w:tab/>
+        <w:t>{{cremation_category_15_check}}</w:t>
       </w:r>
     </w:p>
     <w:p>
+      <w:pPr>
+        <w:tabs>
+          <w:tab w:pos="8929" w:val="right"/>
+        </w:tabs>
+        <w:spacing w:before="0" w:after="0" w:line="240" w:lineRule="auto"/>
+        <w:ind w:left="765" w:hanging="198"/>
+      </w:pPr>
       <w:r>
         <w:rPr>
+          <w:rFonts w:ascii="Times New Roman" w:hAnsi="Times New Roman" w:eastAsia="Times New Roman"/>
           <w:b w:val="0"/>
           <w:i w:val="0"/>
-          <w:sz w:val="26"/>
+          <w:sz w:val="24"/>
         </w:rPr>
-        <w:t>{{cremation_category_18_check}} Trẻ từ 6 tuổi trở xuống, có hộ khẩu tại Thành phố Hồ Chí Minh</w:t>
+        <w:t>- Hộ cận nghèo (theo tiêu chí của Thành phố), mã số: {{cremation_near_poor_detail}}</w:t>
+      </w:r>
+      <w:r>
+        <w:rPr>
+          <w:rFonts w:ascii="Times New Roman" w:hAnsi="Times New Roman" w:eastAsia="Times New Roman"/>
+          <w:b w:val="0"/>
+          <w:i w:val="0"/>
+          <w:sz w:val="24"/>
+        </w:rPr>
+        <w:tab/>
+        <w:t>{{cremation_category_16_check}}</w:t>
       </w:r>
     </w:p>
     <w:p>
+      <w:pPr>
+        <w:tabs>
+          <w:tab w:pos="8929" w:val="right"/>
+        </w:tabs>
+        <w:spacing w:before="0" w:after="0" w:line="240" w:lineRule="auto"/>
+        <w:ind w:left="765" w:hanging="198"/>
+      </w:pPr>
       <w:r>
         <w:rPr>
+          <w:rFonts w:ascii="Times New Roman" w:hAnsi="Times New Roman" w:eastAsia="Times New Roman"/>
           <w:b w:val="0"/>
           <w:i w:val="0"/>
-          <w:sz w:val="26"/>
+          <w:sz w:val="24"/>
         </w:rPr>
-        <w:t>{{cremation_category_19_check}} Trẻ từ 6 tuổi trở xuống, có tạm trú (KT3) tại Thành phố Hồ Chí Minh</w:t>
+        <w:t>- Người dân có hộ khẩu tại Thành phố Hồ Chí Minh</w:t>
+      </w:r>
+      <w:r>
+        <w:rPr>
+          <w:rFonts w:ascii="Times New Roman" w:hAnsi="Times New Roman" w:eastAsia="Times New Roman"/>
+          <w:b w:val="0"/>
+          <w:i w:val="0"/>
+          <w:sz w:val="24"/>
+        </w:rPr>
+        <w:tab/>
+        <w:t>{{cremation_category_17_check}}</w:t>
       </w:r>
     </w:p>
     <w:p>
+      <w:pPr>
+        <w:spacing w:before="0" w:after="0" w:line="240" w:lineRule="auto"/>
+        <w:ind w:left="567"/>
+      </w:pPr>
       <w:r>
         <w:rPr>
+          <w:rFonts w:ascii="Times New Roman" w:hAnsi="Times New Roman" w:eastAsia="Times New Roman"/>
           <w:b w:val="0"/>
           <w:i w:val="0"/>
-          <w:sz w:val="26"/>
+          <w:sz w:val="24"/>
+        </w:rPr>
+        <w:t>- Trẻ từ 6 tuổi trở xuống:</w:t>
+      </w:r>
+    </w:p>
+    <w:p>
+      <w:pPr>
+        <w:tabs>
+          <w:tab w:pos="8929" w:val="right"/>
+        </w:tabs>
+        <w:spacing w:before="0" w:after="0" w:line="240" w:lineRule="auto"/>
+        <w:ind w:left="964" w:hanging="198"/>
+      </w:pPr>
+      <w:r>
+        <w:rPr>
+          <w:rFonts w:ascii="Times New Roman" w:hAnsi="Times New Roman" w:eastAsia="Times New Roman"/>
+          <w:b w:val="0"/>
+          <w:i w:val="0"/>
+          <w:sz w:val="24"/>
+        </w:rPr>
+        <w:t>• Có hộ khẩu tại Thành phố Hồ Chí Minh</w:t>
+      </w:r>
+      <w:r>
+        <w:rPr>
+          <w:rFonts w:ascii="Times New Roman" w:hAnsi="Times New Roman" w:eastAsia="Times New Roman"/>
+          <w:b w:val="0"/>
+          <w:i w:val="0"/>
+          <w:sz w:val="24"/>
+        </w:rPr>
+        <w:tab/>
+        <w:t>{{cremation_category_18_check}}</w:t>
+      </w:r>
+    </w:p>
+    <w:p>
+      <w:pPr>
+        <w:tabs>
+          <w:tab w:pos="8929" w:val="right"/>
+        </w:tabs>
+        <w:spacing w:before="0" w:after="40" w:line="240" w:lineRule="auto"/>
+        <w:ind w:left="964" w:hanging="198"/>
+      </w:pPr>
+      <w:r>
+        <w:rPr>
+          <w:rFonts w:ascii="Times New Roman" w:hAnsi="Times New Roman" w:eastAsia="Times New Roman"/>
+          <w:b w:val="0"/>
+          <w:i w:val="0"/>
+          <w:sz w:val="24"/>
+        </w:rPr>
+        <w:t>• Có tạm trú (KT3) tại Thành phố Hồ Chí Minh</w:t>
+      </w:r>
+      <w:r>
+        <w:rPr>
+          <w:rFonts w:ascii="Times New Roman" w:hAnsi="Times New Roman" w:eastAsia="Times New Roman"/>
+          <w:b w:val="0"/>
+          <w:i w:val="0"/>
+          <w:sz w:val="24"/>
+        </w:rPr>
+        <w:tab/>
+        <w:t>{{cremation_category_19_check}}</w:t>
+      </w:r>
+    </w:p>
+    <w:p>
+      <w:pPr>
+        <w:spacing w:before="0" w:after="40" w:line="240" w:lineRule="auto"/>
+        <w:ind w:firstLine="567"/>
+        <w:jc w:val="both"/>
+      </w:pPr>
+      <w:r>
+        <w:rPr>
+          <w:rFonts w:ascii="Times New Roman" w:hAnsi="Times New Roman" w:eastAsia="Times New Roman"/>
+          <w:b w:val="0"/>
+          <w:i w:val="0"/>
+          <w:sz w:val="24"/>
         </w:rPr>
         <w:t>Tôi xin cam đoan những lời khai trên đây là đúng sự thực, nếu có điều gì khai không đúng sự thật tôi xin chịu trách nhiệm hoàn toàn trước pháp luật.</w:t>
       </w:r>
     </w:p>
     <w:p>
+      <w:pPr>
+        <w:spacing w:before="0" w:after="40" w:line="240" w:lineRule="auto"/>
+        <w:ind w:firstLine="567"/>
+      </w:pPr>
       <w:r>
         <w:rPr>
+          <w:rFonts w:ascii="Times New Roman" w:hAnsi="Times New Roman" w:eastAsia="Times New Roman"/>
           <w:b w:val="0"/>
           <w:i w:val="0"/>
-          <w:sz w:val="26"/>
+          <w:sz w:val="24"/>
         </w:rPr>
         <w:t>Đề nghị Ủy ban nhân dân phường hỗ trợ chi phí khuyến khích hỏa táng.</w:t>
       </w:r>
     </w:p>
+    <w:tbl>
+      <w:tblPr>
+        <w:tblW w:type="auto" w:w="0"/>
+        <w:tblLayout w:type="fixed"/>
+        <w:tblLook w:firstColumn="1" w:firstRow="1" w:lastColumn="0" w:lastRow="0" w:noHBand="0" w:noVBand="1" w:val="04A0"/>
+        <w:tblBorders>
+          <w:top w:val="nil"/>
+          <w:left w:val="nil"/>
+          <w:bottom w:val="nil"/>
+          <w:right w:val="nil"/>
+          <w:insideH w:val="nil"/>
+          <w:insideV w:val="nil"/>
+        </w:tblBorders>
+      </w:tblPr>
+      <w:tblGrid>
+        <w:gridCol w:w="4535"/>
+        <w:gridCol w:w="4932"/>
+      </w:tblGrid>
+      <w:tr>
+        <w:tc>
+          <w:tcPr>
+            <w:tcW w:type="dxa" w:w="4748"/>
+          </w:tcPr>
+          <w:p/>
+        </w:tc>
+        <w:tc>
+          <w:tcPr>
+            <w:tcW w:type="dxa" w:w="4748"/>
+            <w:vAlign w:val="top"/>
+          </w:tcPr>
+          <w:p>
+            <w:pPr>
+              <w:spacing w:after="0"/>
+              <w:jc w:val="center"/>
+            </w:pPr>
+            <w:r>
+              <w:rPr>
+                <w:rFonts w:ascii="Times New Roman" w:hAnsi="Times New Roman" w:eastAsia="Times New Roman"/>
+                <w:b w:val="0"/>
+                <w:i/>
+                <w:sz w:val="24"/>
+              </w:rPr>
+              <w:t>Ngày {{declaration_day}} tháng {{declaration_month}} năm {{declaration_year}}</w:t>
+            </w:r>
+          </w:p>
+          <w:p>
+            <w:pPr>
+              <w:spacing w:after="0"/>
+              <w:jc w:val="center"/>
+            </w:pPr>
+            <w:r>
+              <w:rPr>
+                <w:rFonts w:ascii="Times New Roman" w:hAnsi="Times New Roman" w:eastAsia="Times New Roman"/>
+                <w:b/>
+                <w:i w:val="0"/>
+                <w:sz w:val="24"/>
+              </w:rPr>
+              <w:t>Người khai</w:t>
+            </w:r>
+          </w:p>
+          <w:p>
+            <w:pPr>
+              <w:spacing w:after="0"/>
+              <w:jc w:val="center"/>
+            </w:pPr>
+            <w:r>
+              <w:rPr>
+                <w:rFonts w:ascii="Times New Roman" w:hAnsi="Times New Roman" w:eastAsia="Times New Roman"/>
+                <w:b w:val="0"/>
+                <w:i/>
+                <w:sz w:val="24"/>
+              </w:rPr>
+              <w:t>(ký và ghi rõ họ, tên)</w:t>
+            </w:r>
+          </w:p>
+          <w:p>
+            <w:pPr>
+              <w:spacing w:after="0"/>
+              <w:jc w:val="center"/>
+            </w:pPr>
+            <w:r>
+              <w:rPr>
+                <w:rFonts w:ascii="Times New Roman" w:hAnsi="Times New Roman" w:eastAsia="Times New Roman"/>
+                <w:b w:val="0"/>
+                <w:i w:val="0"/>
+                <w:sz w:val="24"/>
+              </w:rPr>
+            </w:r>
+          </w:p>
+          <w:p>
+            <w:pPr>
+              <w:spacing w:after="0"/>
+              <w:jc w:val="center"/>
+            </w:pPr>
+            <w:r>
+              <w:rPr>
+                <w:rFonts w:ascii="Times New Roman" w:hAnsi="Times New Roman" w:eastAsia="Times New Roman"/>
+                <w:b/>
+                <w:i w:val="0"/>
+                <w:sz w:val="24"/>
+              </w:rPr>
+              <w:t>{{full_name}}</w:t>
+            </w:r>
+          </w:p>
+        </w:tc>
+      </w:tr>
+    </w:tbl>
     <w:p>
       <w:pPr>
-        <w:jc w:val="right"/>
+        <w:spacing w:before="0" w:after="20" w:line="240" w:lineRule="auto"/>
+        <w:pBdr>
+          <w:bottom w:val="single" w:sz="6" w:space="1" w:color="000000"/>
+        </w:pBdr>
+      </w:pPr>
+    </w:p>
+    <w:p>
+      <w:pPr>
+        <w:spacing w:before="0" w:after="0" w:line="240" w:lineRule="auto"/>
       </w:pPr>
       <w:r>
         <w:rPr>
+          <w:rFonts w:ascii="Times New Roman" w:hAnsi="Times New Roman" w:eastAsia="Times New Roman"/>
           <w:b w:val="0"/>
-          <w:i/>
-          <w:sz w:val="26"/>
-        </w:rPr>
-        <w:t>Ngày … tháng … năm 20…</w:t>
-      </w:r>
-    </w:p>
-    <w:p>
-      <w:pPr>
-        <w:jc w:val="right"/>
-      </w:pPr>
-      <w:r>
-        <w:rPr>
-          <w:b/>
           <w:i w:val="0"/>
-          <w:sz w:val="26"/>
-        </w:rPr>
-        <w:t>Người khai</w:t>
-      </w:r>
-    </w:p>
-    <w:p>
-      <w:pPr>
-        <w:jc w:val="right"/>
-      </w:pPr>
-      <w:r>
-        <w:rPr>
-          <w:b w:val="0"/>
-          <w:i/>
-          <w:sz w:val="26"/>
-        </w:rPr>
-        <w:t>(ký và ghi rõ họ, tên)</w:t>
-      </w:r>
-    </w:p>
-    <w:p/>
-    <w:p>
-      <w:r>
-        <w:rPr>
-          <w:b/>
-          <w:i w:val="0"/>
-          <w:sz w:val="26"/>
+          <w:sz w:val="23"/>
         </w:rPr>
         <w:t>Xác nhận của UBND phường Minh Phụng:</w:t>
       </w:r>
     </w:p>
     <w:p>
+      <w:pPr>
+        <w:spacing w:before="0" w:after="0" w:line="240" w:lineRule="auto"/>
+      </w:pPr>
       <w:r>
         <w:rPr>
+          <w:rFonts w:ascii="Times New Roman" w:hAnsi="Times New Roman" w:eastAsia="Times New Roman"/>
           <w:b w:val="0"/>
           <w:i w:val="0"/>
-          <w:sz w:val="26"/>
+          <w:sz w:val="23"/>
         </w:rPr>
-        <w:t>Ông (bà) (1)………………………………………………, sinh năm …………………</w:t>
+        <w:t>Ông (bà) (1) ..................................................................... , sinh năm ...............................</w:t>
       </w:r>
     </w:p>
     <w:p>
+      <w:pPr>
+        <w:spacing w:before="0" w:after="0" w:line="240" w:lineRule="auto"/>
+      </w:pPr>
       <w:r>
         <w:rPr>
+          <w:rFonts w:ascii="Times New Roman" w:hAnsi="Times New Roman" w:eastAsia="Times New Roman"/>
           <w:b w:val="0"/>
           <w:i w:val="0"/>
-          <w:sz w:val="26"/>
+          <w:sz w:val="23"/>
         </w:rPr>
-        <w:t>Hiện cư trú tại: ……………………………………………………………………………</w:t>
+        <w:t>Hiện cư trú tại: .................................................................................................................</w:t>
       </w:r>
     </w:p>
     <w:p>
+      <w:pPr>
+        <w:spacing w:before="0" w:after="0" w:line="240" w:lineRule="auto"/>
+      </w:pPr>
       <w:r>
         <w:rPr>
+          <w:rFonts w:ascii="Times New Roman" w:hAnsi="Times New Roman" w:eastAsia="Times New Roman"/>
           <w:b w:val="0"/>
           <w:i w:val="0"/>
-          <w:sz w:val="26"/>
+          <w:sz w:val="23"/>
         </w:rPr>
-        <w:t>Là (2)………………………………………………………………………………………</w:t>
+        <w:t>Là (2) ........................................ ........................................................................................</w:t>
       </w:r>
     </w:p>
     <w:p>
+      <w:pPr>
+        <w:spacing w:before="0" w:after="0" w:line="240" w:lineRule="auto"/>
+      </w:pPr>
       <w:r>
         <w:rPr>
+          <w:rFonts w:ascii="Times New Roman" w:hAnsi="Times New Roman" w:eastAsia="Times New Roman"/>
           <w:b w:val="0"/>
           <w:i w:val="0"/>
-          <w:sz w:val="26"/>
+          <w:sz w:val="23"/>
         </w:rPr>
-        <w:t>(hoặc đại diện: ……………………………………………………………………………)</w:t>
+        <w:t>(hoặc đại diện: ........................................ ...................................................................... )</w:t>
       </w:r>
     </w:p>
     <w:p>
+      <w:pPr>
+        <w:spacing w:before="0" w:after="0" w:line="240" w:lineRule="auto"/>
+      </w:pPr>
       <w:r>
         <w:rPr>
+          <w:rFonts w:ascii="Times New Roman" w:hAnsi="Times New Roman" w:eastAsia="Times New Roman"/>
           <w:b w:val="0"/>
           <w:i w:val="0"/>
-          <w:sz w:val="26"/>
+          <w:sz w:val="23"/>
         </w:rPr>
-        <w:t>của ông (bà) (3)……………………………………………………………………………</w:t>
+        <w:t>của ông (bà) (3) ...................................................................................................................</w:t>
       </w:r>
     </w:p>
     <w:p>
+      <w:pPr>
+        <w:spacing w:before="0" w:after="0" w:line="240" w:lineRule="auto"/>
+      </w:pPr>
       <w:r>
         <w:rPr>
+          <w:rFonts w:ascii="Times New Roman" w:hAnsi="Times New Roman" w:eastAsia="Times New Roman"/>
           <w:b w:val="0"/>
           <w:i w:val="0"/>
-          <w:sz w:val="26"/>
+          <w:sz w:val="23"/>
         </w:rPr>
-        <w:t>thuộc đối tượng (4) …………………………………………………………………………</w:t>
+        <w:t>thuộc đối tượng (4) ..............................................................................................................</w:t>
       </w:r>
     </w:p>
     <w:p>
+      <w:pPr>
+        <w:spacing w:before="0" w:after="0" w:line="240" w:lineRule="auto"/>
+      </w:pPr>
       <w:r>
         <w:rPr>
+          <w:rFonts w:ascii="Times New Roman" w:hAnsi="Times New Roman" w:eastAsia="Times New Roman"/>
           <w:b w:val="0"/>
           <w:i w:val="0"/>
-          <w:sz w:val="26"/>
+          <w:sz w:val="23"/>
         </w:rPr>
-        <w:t>……………………………………………………………………………………………</w:t>
+        <w:t>................................................................................................................................................</w:t>
       </w:r>
     </w:p>
     <w:p>
+      <w:pPr>
+        <w:spacing w:before="0" w:after="0" w:line="240" w:lineRule="auto"/>
+      </w:pPr>
       <w:r>
         <w:rPr>
+          <w:rFonts w:ascii="Times New Roman" w:hAnsi="Times New Roman" w:eastAsia="Times New Roman"/>
           <w:b w:val="0"/>
           <w:i w:val="0"/>
-          <w:sz w:val="26"/>
+          <w:sz w:val="23"/>
         </w:rPr>
         <w:t>đã chết ngày…….tháng…….năm ……………</w:t>
       </w:r>
     </w:p>
     <w:p>
+      <w:pPr>
+        <w:spacing w:before="0" w:after="0" w:line="240" w:lineRule="auto"/>
+      </w:pPr>
       <w:r>
         <w:rPr>
+          <w:rFonts w:ascii="Times New Roman" w:hAnsi="Times New Roman" w:eastAsia="Times New Roman"/>
           <w:b w:val="0"/>
           <w:i w:val="0"/>
-          <w:sz w:val="26"/>
+          <w:sz w:val="23"/>
         </w:rPr>
         <w:t>Đề nghị được giải quyết chế độ hỗ trợ chi phí khuyến khích hỏa táng./.</w:t>
       </w:r>
     </w:p>
+    <w:tbl>
+      <w:tblPr>
+        <w:tblW w:type="auto" w:w="0"/>
+        <w:tblLayout w:type="fixed"/>
+        <w:tblLook w:firstColumn="1" w:firstRow="1" w:lastColumn="0" w:lastRow="0" w:noHBand="0" w:noVBand="1" w:val="04A0"/>
+        <w:tblBorders>
+          <w:top w:val="nil"/>
+          <w:left w:val="nil"/>
+          <w:bottom w:val="nil"/>
+          <w:right w:val="nil"/>
+          <w:insideH w:val="nil"/>
+          <w:insideV w:val="nil"/>
+        </w:tblBorders>
+      </w:tblPr>
+      <w:tblGrid>
+        <w:gridCol w:w="4535"/>
+        <w:gridCol w:w="4932"/>
+      </w:tblGrid>
+      <w:tr>
+        <w:tc>
+          <w:tcPr>
+            <w:tcW w:type="dxa" w:w="4748"/>
+          </w:tcPr>
+          <w:p/>
+        </w:tc>
+        <w:tc>
+          <w:tcPr>
+            <w:tcW w:type="dxa" w:w="4748"/>
+          </w:tcPr>
+          <w:p>
+            <w:pPr>
+              <w:spacing w:after="0"/>
+              <w:jc w:val="center"/>
+            </w:pPr>
+            <w:r>
+              <w:rPr>
+                <w:rFonts w:ascii="Times New Roman" w:hAnsi="Times New Roman" w:eastAsia="Times New Roman"/>
+                <w:b w:val="0"/>
+                <w:i/>
+                <w:sz w:val="23"/>
+              </w:rPr>
+              <w:t>…………, ngày......tháng......năm 20...</w:t>
+            </w:r>
+          </w:p>
+          <w:p>
+            <w:pPr>
+              <w:spacing w:after="0"/>
+              <w:jc w:val="center"/>
+            </w:pPr>
+            <w:r>
+              <w:rPr>
+                <w:rFonts w:ascii="Times New Roman" w:hAnsi="Times New Roman" w:eastAsia="Times New Roman"/>
+                <w:b/>
+                <w:i w:val="0"/>
+                <w:sz w:val="23"/>
+              </w:rPr>
+              <w:t>Chủ tịch</w:t>
+            </w:r>
+          </w:p>
+        </w:tc>
+      </w:tr>
+    </w:tbl>
     <w:p>
       <w:pPr>
-        <w:jc w:val="right"/>
+        <w:spacing w:before="0" w:after="0" w:line="240" w:lineRule="auto"/>
+        <w:ind w:left="57"/>
       </w:pPr>
       <w:r>
         <w:rPr>
+          <w:rFonts w:ascii="Times New Roman" w:hAnsi="Times New Roman" w:eastAsia="Times New Roman"/>
           <w:b w:val="0"/>
-          <w:i/>
-          <w:sz w:val="26"/>
-        </w:rPr>
-        <w:t>…………, ngày......tháng......năm 20...</w:t>
-      </w:r>
-    </w:p>
-    <w:p>
-      <w:pPr>
-        <w:jc w:val="right"/>
-      </w:pPr>
-      <w:r>
-        <w:rPr>
-          <w:b/>
           <w:i w:val="0"/>
-          <w:sz w:val="26"/>
-        </w:rPr>
-        <w:t>Chủ tịch</w:t>
-      </w:r>
-    </w:p>
-    <w:p/>
-    <w:p>
-      <w:r>
-        <w:rPr>
-          <w:b w:val="0"/>
-          <w:i/>
-          <w:sz w:val="26"/>
+          <w:sz w:val="20"/>
         </w:rPr>
         <w:t>(1) Đối tượng thực hiện thủ tục hành chính tại mục 1;</w:t>
       </w:r>
     </w:p>
     <w:p>
+      <w:pPr>
+        <w:spacing w:before="0" w:after="0" w:line="240" w:lineRule="auto"/>
+        <w:ind w:left="57"/>
+      </w:pPr>
       <w:r>
         <w:rPr>
+          <w:rFonts w:ascii="Times New Roman" w:hAnsi="Times New Roman" w:eastAsia="Times New Roman"/>
           <w:b w:val="0"/>
-          <w:i/>
-          <w:sz w:val="26"/>
+          <w:i w:val="0"/>
+          <w:sz w:val="20"/>
         </w:rPr>
         <w:t>(2) Mối quan hệ nhân thân được thể hiện tại mục 4;</w:t>
       </w:r>
     </w:p>
     <w:p>
+      <w:pPr>
+        <w:spacing w:before="0" w:after="0" w:line="240" w:lineRule="auto"/>
+        <w:ind w:left="57"/>
+      </w:pPr>
       <w:r>
         <w:rPr>
+          <w:rFonts w:ascii="Times New Roman" w:hAnsi="Times New Roman" w:eastAsia="Times New Roman"/>
           <w:b w:val="0"/>
-          <w:i/>
-          <w:sz w:val="26"/>
+          <w:i w:val="0"/>
+          <w:sz w:val="20"/>
         </w:rPr>
         <w:t>(3) Đối tượng được nêu tại mục 5;</w:t>
       </w:r>
     </w:p>
     <w:p>
+      <w:pPr>
+        <w:spacing w:before="0" w:after="0" w:line="240" w:lineRule="auto"/>
+        <w:ind w:left="57"/>
+      </w:pPr>
       <w:r>
         <w:rPr>
+          <w:rFonts w:ascii="Times New Roman" w:hAnsi="Times New Roman" w:eastAsia="Times New Roman"/>
           <w:b w:val="0"/>
-          <w:i/>
-          <w:sz w:val="26"/>
+          <w:i w:val="0"/>
+          <w:sz w:val="20"/>
         </w:rPr>
         <w:t>(4) Đối tượng được nêu tại mục 7.</w:t>
       </w:r>
     </w:p>
     <w:sectPr>
-      <w:pgSz w:w="12240" w:h="15840"/>
-      <w:pgMar w:top="851" w:right="1440" w:bottom="993" w:left="1440" w:header="720" w:footer="720" w:gutter="0"/>
+      <w:pgSz w:w="11906" w:h="16838"/>
+      <w:pgMar w:top="935" w:right="1134" w:bottom="765" w:left="1276" w:header="283" w:footer="283" w:gutter="0"/>
       <w:cols w:space="720"/>
       <w:docGrid w:linePitch="360"/>
     </w:sectPr>
@@ -966,6 +1786,10 @@
     <w:name w:val="Normal"/>
     <w:qFormat/>
     <w:rsid w:val="00FC693F"/>
+    <w:rPr>
+      <w:rFonts w:ascii="Times New Roman" w:hAnsi="Times New Roman" w:eastAsia="Times New Roman"/>
+      <w:sz w:val="24"/>
+    </w:rPr>
   </w:style>
   <w:style w:type="paragraph" w:styleId="Header">
     <w:name w:val="header"/>

</xml_diff>